<commit_message>
Corrige la agenda médica, el panel de inicio y la ficha clínica; agrega validaciones consistentes en los formularios.
Se ajustó para que los médicos vean sus pacientes y atenciones asignados correctamente.

- Se habilitó el registro de diagnósticos y se mejoró el historial de atenciones en la ficha del paciente.
- Se corrigieron los conteos de pacientes y las listas de citas de hoy y de los próximos días en Inicio.
- Se ajustó la agenda para mostrar las citas del profesional y permitir buscar pacientes y atenciones.
- Se agregaron validaciones de datos en formularios de pacientes, citas y atenciones, además de reglas de seguridad para contraseñas.
- Se actualizó el documento de estado de requerimientos con requisitos listos, pendientes y parciales.

Verificación: `manage.py check` sin errores y 38 pruebas aprobadas.
</commit_message>
<xml_diff>
--- a/docs/Estado_Requerimientos_NeuroFicha.docx
+++ b/docs/Estado_Requerimientos_NeuroFicha.docx
@@ -37,7 +37,7 @@
         <w:t xml:space="preserve">Resumen revisado: </w:t>
       </w:r>
       <w:r>
-        <w:t>57 de 111 requerimientos funcionales marcados y 1 de 20 no funcionales marcados. La marca indica respaldo actual, no una certificación del sistema completo.</w:t>
+        <w:t>70 de 111 requerimientos funcionales marcados y 1 de 20 no funcionales marcados. La marca indica respaldo actual, no una certificación del sistema completo.</w:t>
       </w:r>
     </w:p>
     <w:p>
@@ -292,7 +292,7 @@
               </w:rPr>
               <w:t>RF-05</w:t>
               <w:br/>
-              <w:t>☐</w:t>
+              <w:t>☒</w:t>
             </w:r>
           </w:p>
         </w:tc>
@@ -312,7 +312,7 @@
               </w:rPr>
               <w:t>El sistema deberá permitir recuperar o restablecer la contraseña mediante un mecanismo seguro.</w:t>
               <w:br/>
-              <w:t>Pendiente: El formulario exige correo único y existe el flujo de restablecimiento; queda configurar y comprobar SMTP para el envío real.</w:t>
+              <w:t>Nota: Completado según la confirmación del usuario.</w:t>
             </w:r>
           </w:p>
         </w:tc>
@@ -640,7 +640,7 @@
               </w:rPr>
               <w:t>RF-12</w:t>
               <w:br/>
-              <w:t>☐</w:t>
+              <w:t>☒</w:t>
             </w:r>
           </w:p>
         </w:tc>
@@ -658,6 +658,8 @@
                 <w:sz w:val="16"/>
               </w:rPr>
               <w:t>El sistema deberá permitir registrar la profesión del profesional.</w:t>
+              <w:br/>
+              <w:t>Nota: Completado: Usuario tiene un campo profesión independiente del rol y obligatorio para cuentas MEDICO.</w:t>
             </w:r>
           </w:p>
         </w:tc>
@@ -681,7 +683,7 @@
               </w:rPr>
               <w:t>RF-13</w:t>
               <w:br/>
-              <w:t>☐</w:t>
+              <w:t>☒</w:t>
             </w:r>
           </w:p>
         </w:tc>
@@ -700,6 +702,8 @@
                 <w:sz w:val="16"/>
               </w:rPr>
               <w:t>El sistema deberá permitir registrar la especialidad o área de atención del profesional cuando corresponda.</w:t>
+              <w:br/>
+              <w:t>Nota: Usuario.especialidad existe y se puede editar al crear o modificar cuentas desde el administrador.</w:t>
             </w:r>
           </w:p>
         </w:tc>
@@ -822,6 +826,8 @@
                 <w:sz w:val="16"/>
               </w:rPr>
               <w:t>El sistema deberá identificar al profesional responsable de cada atención, tratamiento o informe.</w:t>
+              <w:br/>
+              <w:t>Pendiente: Parcial: cada atención identifica al profesional responsable y guarda sus indicaciones/tratamiento; sigue faltando un módulo de informes asociado.</w:t>
             </w:r>
           </w:p>
         </w:tc>
@@ -1251,7 +1257,7 @@
               </w:rPr>
               <w:t>RF-24</w:t>
               <w:br/>
-              <w:t>☐</w:t>
+              <w:t>☒</w:t>
             </w:r>
           </w:p>
         </w:tc>
@@ -1271,7 +1277,7 @@
               </w:rPr>
               <w:t>El administrador deberá poder asignar uno o más profesionales de salud a un paciente.</w:t>
               <w:br/>
-              <w:t>Pendiente: Existe el modelo de asignación; no se encontró flujo de administración de asignaciones en la aplicación.</w:t>
+              <w:t>Nota: El modelo y el administrador permiten gestionar asignaciones entre pacientes y profesionales.</w:t>
             </w:r>
           </w:p>
         </w:tc>
@@ -1294,7 +1300,7 @@
               </w:rPr>
               <w:t>RF-25</w:t>
               <w:br/>
-              <w:t>☐</w:t>
+              <w:t>☒</w:t>
             </w:r>
           </w:p>
         </w:tc>
@@ -1313,7 +1319,7 @@
               </w:rPr>
               <w:t>El sistema deberá permitir que un paciente tenga simultáneamente profesionales de diferentes disciplinas.</w:t>
               <w:br/>
-              <w:t>Pendiente: El modelo admite varias asignaciones, pero no se gestiona profesión/disciplina del profesional.</w:t>
+              <w:t>Nota: Un paciente puede tener asignaciones para varios profesionales; profesión y especialidad se registran en sus cuentas.</w:t>
             </w:r>
           </w:p>
         </w:tc>
@@ -1378,7 +1384,7 @@
               </w:rPr>
               <w:t>RF-27</w:t>
               <w:br/>
-              <w:t>☐</w:t>
+              <w:t>☒</w:t>
             </w:r>
           </w:p>
         </w:tc>
@@ -1397,7 +1403,7 @@
               </w:rPr>
               <w:t>El administrador deberá poder finalizar una asignación profesional-paciente.</w:t>
               <w:br/>
-              <w:t>Pendiente: La asignación tiene un indicador activa, sin registrar fecha de término.</w:t>
+              <w:t>Nota: Al finalizar una asignación desde el administrador se registra automáticamente la fecha de término.</w:t>
             </w:r>
           </w:p>
         </w:tc>
@@ -1462,7 +1468,7 @@
               </w:rPr>
               <w:t>RF-29</w:t>
               <w:br/>
-              <w:t>☐</w:t>
+              <w:t>☒</w:t>
             </w:r>
           </w:p>
         </w:tc>
@@ -1481,7 +1487,7 @@
               </w:rPr>
               <w:t>El sistema deberá mostrar los profesionales actualmente asignados a cada paciente.</w:t>
               <w:br/>
-              <w:t>Pendiente: No se encontró una vista que muestre los profesionales asignados al paciente.</w:t>
+              <w:t>Nota: La ficha del paciente muestra los profesionales asignados actualmente.</w:t>
             </w:r>
           </w:p>
         </w:tc>
@@ -2056,7 +2062,7 @@
               </w:rPr>
               <w:t>RF-42</w:t>
               <w:br/>
-              <w:t>☐</w:t>
+              <w:t>☒</w:t>
             </w:r>
           </w:p>
         </w:tc>
@@ -2076,7 +2082,7 @@
               </w:rPr>
               <w:t>El sistema deberá permitir diferenciar el tipo de atención realizada según la disciplina o servicio.</w:t>
               <w:br/>
-              <w:t>Pendiente: La atención no guarda un tipo o disciplina.</w:t>
+              <w:t>Nota: Cada nueva atención solicita y guarda su disciplina o servicio, independiente del tipo de cita.</w:t>
             </w:r>
           </w:p>
         </w:tc>
@@ -2405,7 +2411,7 @@
               </w:rPr>
               <w:t>RF-49</w:t>
               <w:br/>
-              <w:t>☐</w:t>
+              <w:t>☒</w:t>
             </w:r>
           </w:p>
         </w:tc>
@@ -2425,7 +2431,7 @@
               </w:rPr>
               <w:t>El sistema deberá impedir que un profesional modifique una atención de otro profesional cuando no tenga autorización para hacerlo.</w:t>
               <w:br/>
-              <w:t>Pendiente: No existe edición de atenciones en las vistas del proyecto.</w:t>
+              <w:t>Nota: Django Admin filtra las atenciones del médico autenticado y deniega ver o cambiar las de otro profesional.</w:t>
             </w:r>
           </w:p>
         </w:tc>
@@ -3924,7 +3930,7 @@
               </w:rPr>
               <w:t>RF-80</w:t>
               <w:br/>
-              <w:t>☐</w:t>
+              <w:t>☒</w:t>
             </w:r>
           </w:p>
         </w:tc>
@@ -3943,7 +3949,7 @@
               </w:rPr>
               <w:t>El profesional deberá poder consultar sus próximas citas.</w:t>
               <w:br/>
-              <w:t>Pendiente: La agenda permite seleccionar profesionales desde el calendario; no hay una vista de próximas citas exclusiva del profesional.</w:t>
+              <w:t>Nota: El inicio limita al médico autenticado sus citas de hoy y las próximas; los otros roles conservan su vista general.</w:t>
             </w:r>
           </w:p>
         </w:tc>
@@ -4866,7 +4872,7 @@
               </w:rPr>
               <w:t>RF-100</w:t>
               <w:br/>
-              <w:t>☐</w:t>
+              <w:t>☒</w:t>
             </w:r>
           </w:p>
         </w:tc>
@@ -4884,6 +4890,8 @@
                 <w:sz w:val="16"/>
               </w:rPr>
               <w:t>La recepcionista deberá poder consultar los profesionales asociados a un paciente cuando sea necesario para gestionar una cita.</w:t>
+              <w:br/>
+              <w:t>Nota: La ficha del paciente muestra a recepción y administración los profesionales asociados actualmente.</w:t>
             </w:r>
           </w:p>
         </w:tc>
@@ -4989,7 +4997,7 @@
               </w:rPr>
               <w:t>RF-103</w:t>
               <w:br/>
-              <w:t>☐</w:t>
+              <w:t>☒</w:t>
             </w:r>
           </w:p>
         </w:tc>
@@ -5009,7 +5017,7 @@
               </w:rPr>
               <w:t>El administrador deberá poder consultar el historial de asignaciones de profesionales.</w:t>
               <w:br/>
-              <w:t>Pendiente: Existe el modelo de asignación, pero no consulta/historial administrativo visible identificado.</w:t>
+              <w:t>Nota: Administración puede consultar el historial de asignaciones con fechas de inicio y término; las asignaciones previas a este cambio conservan término vacío si no había dato.</w:t>
             </w:r>
           </w:p>
         </w:tc>
@@ -5132,7 +5140,7 @@
               </w:rPr>
               <w:t>RF-105</w:t>
               <w:br/>
-              <w:t>☐</w:t>
+              <w:t>☒</w:t>
             </w:r>
           </w:p>
         </w:tc>
@@ -5152,7 +5160,7 @@
               </w:rPr>
               <w:t>El sistema deberá registrar los accesos a información clínica sensible.</w:t>
               <w:br/>
-              <w:t>Pendiente: Se audita la apertura de la ficha, pero falta comprobar que se registren todos los accesos clínicos sensibles (por ejemplo, detalle de atención).</w:t>
+              <w:t>Nota: Se audita el acceso al detalle de atenciones y a fichas/antecedentes desde las vistas y el administrador.</w:t>
             </w:r>
           </w:p>
         </w:tc>
@@ -6288,12 +6296,1081 @@
         <w:pStyle w:val="Heading1"/>
       </w:pPr>
       <w:r>
+        <w:t>Requerimientos funcionales listos</w:t>
+      </w:r>
+    </w:p>
+    <w:p>
+      <w:r>
+        <w:rPr>
+          <w:b/>
+        </w:rPr>
+        <w:t xml:space="preserve">Autenticación y control de acceso: </w:t>
+      </w:r>
+      <w:r>
+        <w:t>RF-01, RF-02, RF-03, RF-04, RF-05, RF-06, RF-07, RF-08</w:t>
+      </w:r>
+    </w:p>
+    <w:p>
+      <w:r>
+        <w:rPr>
+          <w:b/>
+        </w:rPr>
+        <w:t xml:space="preserve">Gestión de profesionales: </w:t>
+      </w:r>
+      <w:r>
+        <w:t>RF-09, RF-10, RF-11, RF-12, RF-13, RF-14, RF-15</w:t>
+      </w:r>
+    </w:p>
+    <w:p>
+      <w:r>
+        <w:rPr>
+          <w:b/>
+        </w:rPr>
+        <w:t xml:space="preserve">Gestión de pacientes: </w:t>
+      </w:r>
+      <w:r>
+        <w:t>RF-17, RF-18, RF-19, RF-20, RF-21, RF-22, RF-23</w:t>
+      </w:r>
+    </w:p>
+    <w:p>
+      <w:r>
+        <w:rPr>
+          <w:b/>
+        </w:rPr>
+        <w:t xml:space="preserve">Equipo de atención y asignaciones: </w:t>
+      </w:r>
+      <w:r>
+        <w:t>RF-24, RF-25, RF-26, RF-27, RF-29, RF-30, RF-31</w:t>
+      </w:r>
+    </w:p>
+    <w:p>
+      <w:r>
+        <w:rPr>
+          <w:b/>
+        </w:rPr>
+        <w:t xml:space="preserve">Ficha clínica e historial: </w:t>
+      </w:r>
+      <w:r>
+        <w:t>RF-32, RF-33, RF-34, RF-35, RF-36, RF-37, RF-38, RF-39, RF-40, RF-41, RF-42</w:t>
+      </w:r>
+    </w:p>
+    <w:p>
+      <w:r>
+        <w:rPr>
+          <w:b/>
+        </w:rPr>
+        <w:t xml:space="preserve">Atenciones clínicas: </w:t>
+      </w:r>
+      <w:r>
+        <w:t>RF-43, RF-44, RF-45, RF-46, RF-47, RF-48, RF-49</w:t>
+      </w:r>
+    </w:p>
+    <w:p>
+      <w:r>
+        <w:rPr>
+          <w:b/>
+        </w:rPr>
+        <w:t xml:space="preserve">Agenda y citas: </w:t>
+      </w:r>
+      <w:r>
+        <w:t>RF-73, RF-74, RF-75, RF-76, RF-78, RF-79, RF-80, RF-81, RF-82, RF-83</w:t>
+      </w:r>
+    </w:p>
+    <w:p>
+      <w:r>
+        <w:rPr>
+          <w:b/>
+        </w:rPr>
+        <w:t xml:space="preserve">Administración y recepción: </w:t>
+      </w:r>
+      <w:r>
+        <w:t>RF-99, RF-100, RF-101, RF-102, RF-103, RF-104</w:t>
+      </w:r>
+    </w:p>
+    <w:p>
+      <w:r>
+        <w:rPr>
+          <w:b/>
+        </w:rPr>
+        <w:t xml:space="preserve">Auditoría y trazabilidad: </w:t>
+      </w:r>
+      <w:r>
+        <w:t>RF-105, RF-106, RF-107, RF-108, RF-109, RF-110, RF-111</w:t>
+      </w:r>
+    </w:p>
+    <w:p>
+      <w:r>
+        <w:rPr>
+          <w:b/>
+        </w:rPr>
+        <w:t xml:space="preserve">Requerimientos no funcionales listos: </w:t>
+      </w:r>
+      <w:r>
+        <w:t>RNF-16</w:t>
+      </w:r>
+    </w:p>
+    <w:p>
+      <w:pPr>
+        <w:pStyle w:val="Heading1"/>
+      </w:pPr>
+      <w:r>
+        <w:t>Requerimientos pendientes y parciales</w:t>
+      </w:r>
+    </w:p>
+    <w:p>
+      <w:r>
+        <w:t>La tabla siguiente identifica de forma directa lo que falta o requiere completar. Los requisitos parcialmente implementados se mantienen fuera de la lista de completos.</w:t>
+      </w:r>
+    </w:p>
+    <w:p>
+      <w:pPr>
+        <w:pStyle w:val="ListBullet"/>
+      </w:pPr>
+      <w:r>
+        <w:rPr>
+          <w:b/>
+        </w:rPr>
+        <w:t xml:space="preserve">RF-16 — PARCIAL. </w:t>
+      </w:r>
+      <w:r>
+        <w:t>Parcial: cada atención identifica al profesional responsable y guarda sus indicaciones/tratamiento; sigue faltando un módulo de informes asociado.</w:t>
+      </w:r>
+    </w:p>
+    <w:p>
+      <w:pPr>
+        <w:pStyle w:val="Heading2"/>
+      </w:pPr>
+      <w:r>
+        <w:t>Gestión de profesionales</w:t>
+      </w:r>
+    </w:p>
+    <w:p>
+      <w:pPr>
+        <w:pStyle w:val="ListBullet"/>
+      </w:pPr>
+      <w:r>
+        <w:rPr>
+          <w:b/>
+        </w:rPr>
+        <w:t xml:space="preserve">RF-16 — </w:t>
+      </w:r>
+      <w:r>
+        <w:t>El sistema deberá identificar al profesional responsable de cada atención, tratamiento o informe.</w:t>
+      </w:r>
+      <w:r>
+        <w:t xml:space="preserve"> Nota: Parcial: cada atención identifica al profesional responsable y guarda sus indicaciones/tratamiento; sigue faltando un módulo de informes asociado.</w:t>
+      </w:r>
+    </w:p>
+    <w:p>
+      <w:pPr>
+        <w:pStyle w:val="Heading2"/>
+      </w:pPr>
+      <w:r>
+        <w:t>Equipo de atención y asignaciones</w:t>
+      </w:r>
+    </w:p>
+    <w:p>
+      <w:pPr>
+        <w:pStyle w:val="ListBullet"/>
+      </w:pPr>
+      <w:r>
+        <w:rPr>
+          <w:b/>
+        </w:rPr>
+        <w:t xml:space="preserve">RF-28 — </w:t>
+      </w:r>
+      <w:r>
+        <w:t>El sistema deberá conservar el historial de asignaciones finalizadas.</w:t>
+      </w:r>
+    </w:p>
+    <w:p>
+      <w:pPr>
+        <w:pStyle w:val="Heading2"/>
+      </w:pPr>
+      <w:r>
+        <w:t>Tratamiento farmacológico</w:t>
+      </w:r>
+    </w:p>
+    <w:p>
+      <w:pPr>
+        <w:pStyle w:val="ListBullet"/>
+      </w:pPr>
+      <w:r>
+        <w:rPr>
+          <w:b/>
+        </w:rPr>
+        <w:t xml:space="preserve">RF-50 — </w:t>
+      </w:r>
+      <w:r>
+        <w:t>El sistema deberá permitir registrar tratamientos farmacológicos asociados a un paciente.</w:t>
+      </w:r>
+    </w:p>
+    <w:p>
+      <w:pPr>
+        <w:pStyle w:val="ListBullet"/>
+      </w:pPr>
+      <w:r>
+        <w:rPr>
+          <w:b/>
+        </w:rPr>
+        <w:t xml:space="preserve">RF-51 — </w:t>
+      </w:r>
+      <w:r>
+        <w:t>Cada tratamiento deberá quedar asociado al paciente y al profesional responsable.</w:t>
+      </w:r>
+    </w:p>
+    <w:p>
+      <w:pPr>
+        <w:pStyle w:val="ListBullet"/>
+      </w:pPr>
+      <w:r>
+        <w:rPr>
+          <w:b/>
+        </w:rPr>
+        <w:t xml:space="preserve">RF-52 — </w:t>
+      </w:r>
+      <w:r>
+        <w:t>El sistema deberá permitir registrar medicamento, dosis y frecuencia.</w:t>
+      </w:r>
+    </w:p>
+    <w:p>
+      <w:pPr>
+        <w:pStyle w:val="ListBullet"/>
+      </w:pPr>
+      <w:r>
+        <w:rPr>
+          <w:b/>
+        </w:rPr>
+        <w:t xml:space="preserve">RF-53 — </w:t>
+      </w:r>
+      <w:r>
+        <w:t>El sistema deberá permitir registrar fechas de inicio y término cuando corresponda.</w:t>
+      </w:r>
+    </w:p>
+    <w:p>
+      <w:pPr>
+        <w:pStyle w:val="ListBullet"/>
+      </w:pPr>
+      <w:r>
+        <w:rPr>
+          <w:b/>
+        </w:rPr>
+        <w:t xml:space="preserve">RF-54 — </w:t>
+      </w:r>
+      <w:r>
+        <w:t>El sistema deberá identificar los tratamientos activos e históricos.</w:t>
+      </w:r>
+    </w:p>
+    <w:p>
+      <w:pPr>
+        <w:pStyle w:val="ListBullet"/>
+      </w:pPr>
+      <w:r>
+        <w:rPr>
+          <w:b/>
+        </w:rPr>
+        <w:t xml:space="preserve">RF-55 — </w:t>
+      </w:r>
+      <w:r>
+        <w:t>El sistema deberá conservar el historial de tratamientos anteriores.</w:t>
+      </w:r>
+    </w:p>
+    <w:p>
+      <w:pPr>
+        <w:pStyle w:val="ListBullet"/>
+      </w:pPr>
+      <w:r>
+        <w:rPr>
+          <w:b/>
+        </w:rPr>
+        <w:t xml:space="preserve">RF-56 — </w:t>
+      </w:r>
+      <w:r>
+        <w:t>Los profesionales autorizados deberán poder consultar los tratamientos farmacológicos de sus pacientes.</w:t>
+      </w:r>
+    </w:p>
+    <w:p>
+      <w:pPr>
+        <w:pStyle w:val="ListBullet"/>
+      </w:pPr>
+      <w:r>
+        <w:rPr>
+          <w:b/>
+        </w:rPr>
+        <w:t xml:space="preserve">RF-57 — </w:t>
+      </w:r>
+      <w:r>
+        <w:t>Las acciones de creación, modificación o finalización de un tratamiento deberán quedar sujetas a los permisos definidos para cada profesión.</w:t>
+      </w:r>
+      <w:r>
+        <w:t xml:space="preserve"> Nota: No hay módulo de tratamientos ni permisos por profesión.</w:t>
+      </w:r>
+    </w:p>
+    <w:p>
+      <w:pPr>
+        <w:pStyle w:val="Heading2"/>
+      </w:pPr>
+      <w:r>
+        <w:t>Tratamiento y seguimiento terapéutico</w:t>
+      </w:r>
+    </w:p>
+    <w:p>
+      <w:pPr>
+        <w:pStyle w:val="ListBullet"/>
+      </w:pPr>
+      <w:r>
+        <w:rPr>
+          <w:b/>
+        </w:rPr>
+        <w:t xml:space="preserve">RF-58 — </w:t>
+      </w:r>
+      <w:r>
+        <w:t>El sistema deberá permitir registrar planes o tratamientos terapéuticos asociados a un paciente.</w:t>
+      </w:r>
+    </w:p>
+    <w:p>
+      <w:pPr>
+        <w:pStyle w:val="ListBullet"/>
+      </w:pPr>
+      <w:r>
+        <w:rPr>
+          <w:b/>
+        </w:rPr>
+        <w:t xml:space="preserve">RF-59 — </w:t>
+      </w:r>
+      <w:r>
+        <w:t>El sistema deberá permitir registrar objetivos terapéuticos.</w:t>
+      </w:r>
+    </w:p>
+    <w:p>
+      <w:pPr>
+        <w:pStyle w:val="ListBullet"/>
+      </w:pPr>
+      <w:r>
+        <w:rPr>
+          <w:b/>
+        </w:rPr>
+        <w:t xml:space="preserve">RF-60 — </w:t>
+      </w:r>
+      <w:r>
+        <w:t>El sistema deberá permitir registrar intervenciones realizadas.</w:t>
+      </w:r>
+    </w:p>
+    <w:p>
+      <w:pPr>
+        <w:pStyle w:val="ListBullet"/>
+      </w:pPr>
+      <w:r>
+        <w:rPr>
+          <w:b/>
+        </w:rPr>
+        <w:t xml:space="preserve">RF-61 — </w:t>
+      </w:r>
+      <w:r>
+        <w:t>El sistema deberá permitir registrar evolución y observaciones.</w:t>
+      </w:r>
+    </w:p>
+    <w:p>
+      <w:pPr>
+        <w:pStyle w:val="ListBullet"/>
+      </w:pPr>
+      <w:r>
+        <w:rPr>
+          <w:b/>
+        </w:rPr>
+        <w:t xml:space="preserve">RF-62 — </w:t>
+      </w:r>
+      <w:r>
+        <w:t>Cada plan terapéutico deberá quedar asociado al profesional responsable y al paciente.</w:t>
+      </w:r>
+    </w:p>
+    <w:p>
+      <w:pPr>
+        <w:pStyle w:val="ListBullet"/>
+      </w:pPr>
+      <w:r>
+        <w:rPr>
+          <w:b/>
+        </w:rPr>
+        <w:t xml:space="preserve">RF-63 — </w:t>
+      </w:r>
+      <w:r>
+        <w:t>Los profesionales autorizados deberán poder consultar los planes terapéuticos compartidos de sus pacientes.</w:t>
+      </w:r>
+    </w:p>
+    <w:p>
+      <w:pPr>
+        <w:pStyle w:val="Heading2"/>
+      </w:pPr>
+      <w:r>
+        <w:t>Informes terapéuticos y documentos</w:t>
+      </w:r>
+    </w:p>
+    <w:p>
+      <w:pPr>
+        <w:pStyle w:val="ListBullet"/>
+      </w:pPr>
+      <w:r>
+        <w:rPr>
+          <w:b/>
+        </w:rPr>
+        <w:t xml:space="preserve">RF-64 — </w:t>
+      </w:r>
+      <w:r>
+        <w:t>Los profesionales autorizados deberán poder cargar informes terapéuticos asociados a un paciente.</w:t>
+      </w:r>
+      <w:r>
+        <w:t xml:space="preserve"> Nota: No se encontró módulo para cargar informes.</w:t>
+      </w:r>
+    </w:p>
+    <w:p>
+      <w:pPr>
+        <w:pStyle w:val="ListBullet"/>
+      </w:pPr>
+      <w:r>
+        <w:rPr>
+          <w:b/>
+        </w:rPr>
+        <w:t xml:space="preserve">RF-65 — </w:t>
+      </w:r>
+      <w:r>
+        <w:t>Cada informe deberá estar asociado al paciente y al profesional que lo genera o carga.</w:t>
+      </w:r>
+    </w:p>
+    <w:p>
+      <w:pPr>
+        <w:pStyle w:val="ListBullet"/>
+      </w:pPr>
+      <w:r>
+        <w:rPr>
+          <w:b/>
+        </w:rPr>
+        <w:t xml:space="preserve">RF-66 — </w:t>
+      </w:r>
+      <w:r>
+        <w:t>El sistema deberá registrar la fecha de carga del informe.</w:t>
+      </w:r>
+    </w:p>
+    <w:p>
+      <w:pPr>
+        <w:pStyle w:val="ListBullet"/>
+      </w:pPr>
+      <w:r>
+        <w:rPr>
+          <w:b/>
+        </w:rPr>
+        <w:t xml:space="preserve">RF-67 — </w:t>
+      </w:r>
+      <w:r>
+        <w:t>Los profesionales autorizados deberán poder consultar los informes disponibles de sus pacientes.</w:t>
+      </w:r>
+    </w:p>
+    <w:p>
+      <w:pPr>
+        <w:pStyle w:val="ListBullet"/>
+      </w:pPr>
+      <w:r>
+        <w:rPr>
+          <w:b/>
+        </w:rPr>
+        <w:t xml:space="preserve">RF-68 — </w:t>
+      </w:r>
+      <w:r>
+        <w:t>El administrador deberá poder consultar los informes de todos los pacientes.</w:t>
+      </w:r>
+    </w:p>
+    <w:p>
+      <w:pPr>
+        <w:pStyle w:val="ListBullet"/>
+      </w:pPr>
+      <w:r>
+        <w:rPr>
+          <w:b/>
+        </w:rPr>
+        <w:t xml:space="preserve">RF-69 — </w:t>
+      </w:r>
+      <w:r>
+        <w:t>El administrador deberá poder validar los informes y reportes según sus permisos.</w:t>
+      </w:r>
+      <w:r>
+        <w:t xml:space="preserve"> Nota: No se encontró flujo de validación de informes o reportes.</w:t>
+      </w:r>
+    </w:p>
+    <w:p>
+      <w:pPr>
+        <w:pStyle w:val="ListBullet"/>
+      </w:pPr>
+      <w:r>
+        <w:rPr>
+          <w:b/>
+        </w:rPr>
+        <w:t xml:space="preserve">RF-70 — </w:t>
+      </w:r>
+      <w:r>
+        <w:t>El sistema deberá registrar el estado de validación de cada informe.</w:t>
+      </w:r>
+    </w:p>
+    <w:p>
+      <w:pPr>
+        <w:pStyle w:val="ListBullet"/>
+      </w:pPr>
+      <w:r>
+        <w:rPr>
+          <w:b/>
+        </w:rPr>
+        <w:t xml:space="preserve">RF-71 — </w:t>
+      </w:r>
+      <w:r>
+        <w:t>El sistema deberá conservar el historial de validaciones realizadas.</w:t>
+      </w:r>
+    </w:p>
+    <w:p>
+      <w:pPr>
+        <w:pStyle w:val="ListBullet"/>
+      </w:pPr>
+      <w:r>
+        <w:rPr>
+          <w:b/>
+        </w:rPr>
+        <w:t xml:space="preserve">RF-72 — </w:t>
+      </w:r>
+      <w:r>
+        <w:t>El sistema deberá permitir almacenar documentos asociados a la ficha clínica.</w:t>
+      </w:r>
+    </w:p>
+    <w:p>
+      <w:pPr>
+        <w:pStyle w:val="Heading2"/>
+      </w:pPr>
+      <w:r>
+        <w:t>Agenda y citas</w:t>
+      </w:r>
+    </w:p>
+    <w:p>
+      <w:pPr>
+        <w:pStyle w:val="ListBullet"/>
+      </w:pPr>
+      <w:r>
+        <w:rPr>
+          <w:b/>
+        </w:rPr>
+        <w:t xml:space="preserve">RF-77 — </w:t>
+      </w:r>
+      <w:r>
+        <w:t>La recepcionista deberá poder modificar una cita.</w:t>
+      </w:r>
+      <w:r>
+        <w:t xml:space="preserve"> Nota: No se encontró vista o ruta para editar citas; sí existe cambio de estado.</w:t>
+      </w:r>
+    </w:p>
+    <w:p>
+      <w:pPr>
+        <w:pStyle w:val="Heading2"/>
+      </w:pPr>
+      <w:r>
+        <w:t>RAM y farmacovigilancia</w:t>
+      </w:r>
+    </w:p>
+    <w:p>
+      <w:pPr>
+        <w:pStyle w:val="ListBullet"/>
+      </w:pPr>
+      <w:r>
+        <w:rPr>
+          <w:b/>
+        </w:rPr>
+        <w:t xml:space="preserve">RF-84 — </w:t>
+      </w:r>
+      <w:r>
+        <w:t>El sistema deberá permitir registrar un reporte de reacción adversa a un medicamento (RAM) asociado a un paciente.</w:t>
+      </w:r>
+    </w:p>
+    <w:p>
+      <w:pPr>
+        <w:pStyle w:val="ListBullet"/>
+      </w:pPr>
+      <w:r>
+        <w:rPr>
+          <w:b/>
+        </w:rPr>
+        <w:t xml:space="preserve">RF-85 — </w:t>
+      </w:r>
+      <w:r>
+        <w:t>El reporte RAM deberá poder asociarse al tratamiento farmacológico correspondiente.</w:t>
+      </w:r>
+    </w:p>
+    <w:p>
+      <w:pPr>
+        <w:pStyle w:val="ListBullet"/>
+      </w:pPr>
+      <w:r>
+        <w:rPr>
+          <w:b/>
+        </w:rPr>
+        <w:t xml:space="preserve">RF-86 — </w:t>
+      </w:r>
+      <w:r>
+        <w:t>El sistema deberá identificar el medicamento relacionado con la reacción adversa.</w:t>
+      </w:r>
+    </w:p>
+    <w:p>
+      <w:pPr>
+        <w:pStyle w:val="ListBullet"/>
+      </w:pPr>
+      <w:r>
+        <w:rPr>
+          <w:b/>
+        </w:rPr>
+        <w:t xml:space="preserve">RF-87 — </w:t>
+      </w:r>
+      <w:r>
+        <w:t>El sistema deberá permitir registrar la fecha de inicio de la reacción adversa.</w:t>
+      </w:r>
+    </w:p>
+    <w:p>
+      <w:pPr>
+        <w:pStyle w:val="ListBullet"/>
+      </w:pPr>
+      <w:r>
+        <w:rPr>
+          <w:b/>
+        </w:rPr>
+        <w:t xml:space="preserve">RF-88 — </w:t>
+      </w:r>
+      <w:r>
+        <w:t>El sistema deberá permitir registrar una descripción de la reacción y sus características.</w:t>
+      </w:r>
+    </w:p>
+    <w:p>
+      <w:pPr>
+        <w:pStyle w:val="ListBullet"/>
+      </w:pPr>
+      <w:r>
+        <w:rPr>
+          <w:b/>
+        </w:rPr>
+        <w:t xml:space="preserve">RF-89 — </w:t>
+      </w:r>
+      <w:r>
+        <w:t>El sistema deberá permitir registrar la severidad o gravedad de la reacción.</w:t>
+      </w:r>
+    </w:p>
+    <w:p>
+      <w:pPr>
+        <w:pStyle w:val="ListBullet"/>
+      </w:pPr>
+      <w:r>
+        <w:rPr>
+          <w:b/>
+        </w:rPr>
+        <w:t xml:space="preserve">RF-90 — </w:t>
+      </w:r>
+      <w:r>
+        <w:t>El sistema deberá permitir registrar las acciones tomadas frente a la reacción adversa.</w:t>
+      </w:r>
+    </w:p>
+    <w:p>
+      <w:pPr>
+        <w:pStyle w:val="ListBullet"/>
+      </w:pPr>
+      <w:r>
+        <w:rPr>
+          <w:b/>
+        </w:rPr>
+        <w:t xml:space="preserve">RF-91 — </w:t>
+      </w:r>
+      <w:r>
+        <w:t>El sistema deberá permitir registrar si el tratamiento fue suspendido, modificado o mantenido.</w:t>
+      </w:r>
+    </w:p>
+    <w:p>
+      <w:pPr>
+        <w:pStyle w:val="ListBullet"/>
+      </w:pPr>
+      <w:r>
+        <w:rPr>
+          <w:b/>
+        </w:rPr>
+        <w:t xml:space="preserve">RF-92 — </w:t>
+      </w:r>
+      <w:r>
+        <w:t>El sistema deberá permitir registrar la evolución de la reacción adversa.</w:t>
+      </w:r>
+    </w:p>
+    <w:p>
+      <w:pPr>
+        <w:pStyle w:val="ListBullet"/>
+      </w:pPr>
+      <w:r>
+        <w:rPr>
+          <w:b/>
+        </w:rPr>
+        <w:t xml:space="preserve">RF-93 — </w:t>
+      </w:r>
+      <w:r>
+        <w:t>El reporte RAM deberá quedar asociado al profesional que lo registra.</w:t>
+      </w:r>
+    </w:p>
+    <w:p>
+      <w:pPr>
+        <w:pStyle w:val="ListBullet"/>
+      </w:pPr>
+      <w:r>
+        <w:rPr>
+          <w:b/>
+        </w:rPr>
+        <w:t xml:space="preserve">RF-94 — </w:t>
+      </w:r>
+      <w:r>
+        <w:t>Los profesionales autorizados deberán poder consultar los reportes RAM de sus pacientes.</w:t>
+      </w:r>
+    </w:p>
+    <w:p>
+      <w:pPr>
+        <w:pStyle w:val="ListBullet"/>
+      </w:pPr>
+      <w:r>
+        <w:rPr>
+          <w:b/>
+        </w:rPr>
+        <w:t xml:space="preserve">RF-95 — </w:t>
+      </w:r>
+      <w:r>
+        <w:t>El administrador deberá poder consultar los reportes RAM del sistema.</w:t>
+      </w:r>
+    </w:p>
+    <w:p>
+      <w:pPr>
+        <w:pStyle w:val="ListBullet"/>
+      </w:pPr>
+      <w:r>
+        <w:rPr>
+          <w:b/>
+        </w:rPr>
+        <w:t xml:space="preserve">RF-96 — </w:t>
+      </w:r>
+      <w:r>
+        <w:t>El sistema deberá permitir identificar reportes RAM pendientes de revisión.</w:t>
+      </w:r>
+    </w:p>
+    <w:p>
+      <w:pPr>
+        <w:pStyle w:val="ListBullet"/>
+      </w:pPr>
+      <w:r>
+        <w:rPr>
+          <w:b/>
+        </w:rPr>
+        <w:t xml:space="preserve">RF-97 — </w:t>
+      </w:r>
+      <w:r>
+        <w:t>El sistema deberá conservar el historial de modificaciones y validaciones del reporte RAM.</w:t>
+      </w:r>
+    </w:p>
+    <w:p>
+      <w:pPr>
+        <w:pStyle w:val="ListBullet"/>
+      </w:pPr>
+      <w:r>
+        <w:rPr>
+          <w:b/>
+        </w:rPr>
+        <w:t xml:space="preserve">RF-98 — </w:t>
+      </w:r>
+      <w:r>
+        <w:t>El sistema deberá mostrar, cuando corresponda y según permisos, antecedentes relevantes de RAM al consultar tratamientos del paciente.</w:t>
+      </w:r>
+    </w:p>
+    <w:p>
+      <w:pPr>
+        <w:pStyle w:val="Heading2"/>
+      </w:pPr>
+      <w:r>
+        <w:t>Requerimientos no funcionales pendientes</w:t>
+      </w:r>
+    </w:p>
+    <w:p>
+      <w:pPr>
+        <w:pStyle w:val="ListBullet"/>
+      </w:pPr>
+      <w:r>
+        <w:rPr>
+          <w:b/>
+        </w:rPr>
+        <w:t xml:space="preserve">RNF-01 — </w:t>
+      </w:r>
+      <w:r>
+        <w:t>El sistema deberá proteger la información personal y clínica frente a accesos no autorizados mediante autenticación, autorización, gestión segura de sesiones, HTTPS y almacenamiento seguro de credenciales.</w:t>
+      </w:r>
+    </w:p>
+    <w:p>
+      <w:pPr>
+        <w:pStyle w:val="ListBullet"/>
+      </w:pPr>
+      <w:r>
+        <w:rPr>
+          <w:b/>
+        </w:rPr>
+        <w:t xml:space="preserve">RNF-02 — </w:t>
+      </w:r>
+      <w:r>
+        <w:t>El acceso a información clínica deberá limitarse a usuarios autorizados. Pertenecer al grupo de profesionales no deberá otorgar acceso automático a todos los pacientes.</w:t>
+      </w:r>
+    </w:p>
+    <w:p>
+      <w:pPr>
+        <w:pStyle w:val="ListBullet"/>
+      </w:pPr>
+      <w:r>
+        <w:rPr>
+          <w:b/>
+        </w:rPr>
+        <w:t xml:space="preserve">RNF-03 — </w:t>
+      </w:r>
+      <w:r>
+        <w:t>El control de acceso deberá considerar, como mínimo, rol, profesión, asignación vigente al paciente y tipo de permiso (ver, crear, modificar, validar).</w:t>
+      </w:r>
+    </w:p>
+    <w:p>
+      <w:pPr>
+        <w:pStyle w:val="ListBullet"/>
+      </w:pPr>
+      <w:r>
+        <w:rPr>
+          <w:b/>
+        </w:rPr>
+        <w:t xml:space="preserve">RNF-04 — </w:t>
+      </w:r>
+      <w:r>
+        <w:t>La aplicación y la base de datos deberán mantener relaciones consistentes entre pacientes, profesionales, asignaciones, atenciones, tratamientos, informes, citas y reportes RAM.</w:t>
+      </w:r>
+    </w:p>
+    <w:p>
+      <w:pPr>
+        <w:pStyle w:val="ListBullet"/>
+      </w:pPr>
+      <w:r>
+        <w:rPr>
+          <w:b/>
+        </w:rPr>
+        <w:t xml:space="preserve">RNF-05 — </w:t>
+      </w:r>
+      <w:r>
+        <w:t>Las acciones críticas sobre información clínica deberán ser auditables, identificando usuario, acción, registro afectado, fecha y hora.</w:t>
+      </w:r>
+    </w:p>
+    <w:p>
+      <w:pPr>
+        <w:pStyle w:val="ListBullet"/>
+      </w:pPr>
+      <w:r>
+        <w:rPr>
+          <w:b/>
+        </w:rPr>
+        <w:t xml:space="preserve">RNF-06 — </w:t>
+      </w:r>
+      <w:r>
+        <w:t>El sistema deberá estar disponible durante el horario definido por la clínica. Como objetivo inicial se establece una disponibilidad mensual mínima de 99,5 %, excluyendo mantenimientos programados.</w:t>
+      </w:r>
+    </w:p>
+    <w:p>
+      <w:pPr>
+        <w:pStyle w:val="ListBullet"/>
+      </w:pPr>
+      <w:r>
+        <w:rPr>
+          <w:b/>
+        </w:rPr>
+        <w:t xml:space="preserve">RNF-07 — </w:t>
+      </w:r>
+      <w:r>
+        <w:t>El 95 % de las operaciones habituales deberá responder en menos de 2 segundos bajo condiciones normales de carga. Las búsquedas de pacientes deberán mostrar resultados en menos de 2 segundos para el volumen definido.</w:t>
+      </w:r>
+    </w:p>
+    <w:p>
+      <w:pPr>
+        <w:pStyle w:val="ListBullet"/>
+      </w:pPr>
+      <w:r>
+        <w:rPr>
+          <w:b/>
+        </w:rPr>
+        <w:t xml:space="preserve">RNF-08 — </w:t>
+      </w:r>
+      <w:r>
+        <w:t>La interfaz deberá ser sencilla, consistente y adecuada para usuarios con conocimientos básicos de informática. Las tareas frecuentes de profesionales y recepción deberán requerir el mínimo número razonable de pasos.</w:t>
+      </w:r>
+    </w:p>
+    <w:p>
+      <w:pPr>
+        <w:pStyle w:val="ListBullet"/>
+      </w:pPr>
+      <w:r>
+        <w:rPr>
+          <w:b/>
+        </w:rPr>
+        <w:t xml:space="preserve">RNF-09 — </w:t>
+      </w:r>
+      <w:r>
+        <w:t>La aplicación deberá funcionar correctamente en versiones vigentes de navegadores modernos como Chrome, Edge, Firefox y Safari.</w:t>
+      </w:r>
+    </w:p>
+    <w:p>
+      <w:pPr>
+        <w:pStyle w:val="ListBullet"/>
+      </w:pPr>
+      <w:r>
+        <w:rPr>
+          <w:b/>
+        </w:rPr>
+        <w:t xml:space="preserve">RNF-10 — </w:t>
+      </w:r>
+      <w:r>
+        <w:t>La interfaz deberá adaptarse a las resoluciones de pantalla compatibles definidas para la aplicación web.</w:t>
+      </w:r>
+    </w:p>
+    <w:p>
+      <w:pPr>
+        <w:pStyle w:val="ListBullet"/>
+      </w:pPr>
+      <w:r>
+        <w:rPr>
+          <w:b/>
+        </w:rPr>
+        <w:t xml:space="preserve">RNF-11 — </w:t>
+      </w:r>
+      <w:r>
+        <w:t>La arquitectura deberá permitir aumentar el número de pacientes, profesionales, citas, atenciones, documentos y usuarios sin una reconstrucción completa del sistema.</w:t>
+      </w:r>
+    </w:p>
+    <w:p>
+      <w:pPr>
+        <w:pStyle w:val="ListBullet"/>
+      </w:pPr>
+      <w:r>
+        <w:rPr>
+          <w:b/>
+        </w:rPr>
+        <w:t xml:space="preserve">RNF-12 — </w:t>
+      </w:r>
+      <w:r>
+        <w:t>La información deberá contar con copias de seguridad periódicas y separadas del sistema principal. Los respaldos deberán ser verificables mediante pruebas de restauración.</w:t>
+      </w:r>
+    </w:p>
+    <w:p>
+      <w:pPr>
+        <w:pStyle w:val="ListBullet"/>
+      </w:pPr>
+      <w:r>
+        <w:rPr>
+          <w:b/>
+        </w:rPr>
+        <w:t xml:space="preserve">RNF-13 — </w:t>
+      </w:r>
+      <w:r>
+        <w:t>Deberá existir un mecanismo de recuperación ante pérdida de información o indisponibilidad de la infraestructura. Los objetivos RPO y RTO deberán definirse con la clínica.</w:t>
+      </w:r>
+    </w:p>
+    <w:p>
+      <w:pPr>
+        <w:pStyle w:val="ListBullet"/>
+      </w:pPr>
+      <w:r>
+        <w:rPr>
+          <w:b/>
+        </w:rPr>
+        <w:t xml:space="preserve">RNF-14 — </w:t>
+      </w:r>
+      <w:r>
+        <w:t>El software deberá desarrollarse de forma modular, con separación clara de autenticación, pacientes, profesionales, asignaciones, agenda, atenciones, tratamientos, informes, RAM y auditoría.</w:t>
+      </w:r>
+    </w:p>
+    <w:p>
+      <w:pPr>
+        <w:pStyle w:val="ListBullet"/>
+      </w:pPr>
+      <w:r>
+        <w:rPr>
+          <w:b/>
+        </w:rPr>
+        <w:t xml:space="preserve">RNF-15 — </w:t>
+      </w:r>
+      <w:r>
+        <w:t>El tratamiento de información personal y clínica deberá considerar la normativa aplicable a la operación de la clínica y controles técnicos y organizativos acordes a la sensibilidad de los datos.</w:t>
+      </w:r>
+    </w:p>
+    <w:p>
+      <w:pPr>
+        <w:pStyle w:val="ListBullet"/>
+      </w:pPr>
+      <w:r>
+        <w:rPr>
+          <w:b/>
+        </w:rPr>
+        <w:t xml:space="preserve">RNF-17 — </w:t>
+      </w:r>
+      <w:r>
+        <w:t>Los formularios deberán validar tipos, formatos, campos obligatorios, rangos y relaciones para reducir errores y datos inconsistentes.</w:t>
+      </w:r>
+    </w:p>
+    <w:p>
+      <w:pPr>
+        <w:pStyle w:val="ListBullet"/>
+      </w:pPr>
+      <w:r>
+        <w:rPr>
+          <w:b/>
+        </w:rPr>
+        <w:t xml:space="preserve">RNF-18 — </w:t>
+      </w:r>
+      <w:r>
+        <w:t>El sistema deberá presentar mensajes claros al usuario y registrar errores técnicos sin exponer información sensible.</w:t>
+      </w:r>
+    </w:p>
+    <w:p>
+      <w:pPr>
+        <w:pStyle w:val="ListBullet"/>
+      </w:pPr>
+      <w:r>
+        <w:rPr>
+          <w:b/>
+        </w:rPr>
+        <w:t xml:space="preserve">RNF-19 — </w:t>
+      </w:r>
+      <w:r>
+        <w:t>El sistema deberá generar registros técnicos suficientes para detectar fallos, degradación de rendimiento y errores operativos, sin almacenar innecesariamente datos clínicos en logs técnicos.</w:t>
+      </w:r>
+    </w:p>
+    <w:p>
+      <w:pPr>
+        <w:pStyle w:val="ListBullet"/>
+      </w:pPr>
+      <w:r>
+        <w:rPr>
+          <w:b/>
+        </w:rPr>
+        <w:t xml:space="preserve">RNF-20 — </w:t>
+      </w:r>
+      <w:r>
+        <w:t>Las funcionalidades críticas deberán contar con pruebas funcionales y pruebas automatizadas cuando corresponda, especialmente autenticación, autorización, asignaciones, tratamientos, RAM y auditoría.</w:t>
+      </w:r>
+    </w:p>
+    <w:p>
+      <w:pPr>
+        <w:pStyle w:val="Heading1"/>
+      </w:pPr>
+      <w:r>
         <w:t>Observaciones de la revisión</w:t>
       </w:r>
     </w:p>
     <w:p>
       <w:r>
-        <w:t>La auditoría RF-106 a RF-111 queda marcada según la comprobación del trabajo realizado aportada para NeuroFicha y los mecanismos visibles en el proyecto. RF-105 queda pendiente: la vista de ficha registra la consulta, pero no se confirmó cobertura de todos los accesos clínicos sensibles.</w:t>
+        <w:t>RF-05 se marca completo de acuerdo con tu confirmación. RF-08 también se mantiene completo según indicaste; RF-13 se respalda en el campo de especialidad disponible en el usuario.</w:t>
+      </w:r>
+    </w:p>
+    <w:p>
+      <w:r>
+        <w:t>Entre los requisitos solicitados, RF-12, RF-42, RF-49, RF-80, RF-100, RF-103 y RF-105 quedan implementados. RF-16 sigue parcial: la atención identifica al profesional y sus indicaciones, pero no existe un módulo de informes asociado.</w:t>
       </w:r>
     </w:p>
     <w:p>

</xml_diff>